<commit_message>
Docs: rebuilt-APK report, study pack and analysis script, video script, peer-review forms, member checklists, refreshed final-candidate dossier
Co-Authored-By: Claude Sonnet 5.5 <noreply@anthropic.com>
Claude-Session: https://claude.ai/code/session_01LnTxu9J8VYe5KjJHL4JVs3
</commit_message>
<xml_diff>
--- a/Docs/IVRAR_dossier_DRAFT/IVRAR_Group_16_Technical_Dossier_FINAL_CANDIDATE.docx
+++ b/Docs/IVRAR_dossier_DRAFT/IVRAR_Group_16_Technical_Dossier_FINAL_CANDIDATE.docx
@@ -3384,7 +3384,7 @@
                     <w:sz w:val="15"/>
                     <w:szCs w:val="15"/>
                   </w:rPr>
-                  <w:t xml:space="preserve">f05441073ed9c3fc794deb61c0e17f1da2e487dc (code commit on feature/factory-rescue-vr, team repo bhoomibhandari88/VR-Disaster-Simulator; the instructor monorepo has NOT been updated)</w:t>
+                  <w:t xml:space="preserve">f05441073ed9c3fc794deb61c0e17f1da2e487dc (code commit on feature/factory-rescue-vr, team repo bhoomibhandari88/VR-Disaster-Simulator; per the team, the professor confirmed our own repository is evaluated)</w:t>
                 </w:r>
               </w:sdtContent>
             </w:sdt>
@@ -3940,7 +3940,7 @@
                     <w:sz w:val="15"/>
                     <w:szCs w:val="15"/>
                   </w:rPr>
-                  <w:t xml:space="preserve">21 (whole repo, all authored "Claude")</w:t>
+                  <w:t xml:space="preserve">22 (whole repo at the docs commit that carries this file; all authored "Claude")</w:t>
                 </w:r>
               </w:sdtContent>
             </w:sdt>
@@ -4177,7 +4177,7 @@
                     <w:sz w:val="15"/>
                     <w:szCs w:val="15"/>
                   </w:rPr>
-                  <w:t xml:space="preserve">663 (working tree excl. Library/Builds/.git)</w:t>
+                  <w:t xml:space="preserve">697 (working tree excl. Library/Builds/.git)</w:t>
                 </w:r>
               </w:sdtContent>
             </w:sdt>
@@ -7184,7 +7184,7 @@
                     <w:sz w:val="14"/>
                     <w:szCs w:val="14"/>
                   </w:rPr>
-                  <w:t xml:space="preserve">PENDING — TEAM INPUT REQUIRED</w:t>
+                  <w:t xml:space="preserve">(AI-drafted from the session record; member to confirm) We had AI build the triage UI. On selecting a casualty it printed that casualty findings (e.g. "limping but walking") before the trainee ran any START check.</w:t>
                 </w:r>
               </w:sdtContent>
             </w:sdt>
@@ -7255,7 +7255,7 @@
                     <w:sz w:val="14"/>
                     <w:szCs w:val="14"/>
                   </w:rPr>
-                  <w:t xml:space="preserve">PENDING — TEAM INPUT REQUIRED</w:t>
+                  <w:t xml:space="preserve">(AI-drafted from the session record; member to confirm) Findings must appear only after the trainee runs that check. Found in QA and fixed in commit f054410; a PlayMode test now asserts the description stays neutral.</w:t>
                 </w:r>
               </w:sdtContent>
             </w:sdt>
@@ -7432,7 +7432,7 @@
                     <w:sz w:val="14"/>
                     <w:szCs w:val="14"/>
                   </w:rPr>
-                  <w:t xml:space="preserve">PENDING — TEAM INPUT REQUIRED</w:t>
+                  <w:t xml:space="preserve">(AI-drafted from the session record; member to confirm) AI-written README and release notes quoted 107 EditMode / 29 PlayMode tests and an APK SHA-256 for the pre-fix build.</w:t>
                 </w:r>
               </w:sdtContent>
             </w:sdt>
@@ -7503,7 +7503,7 @@
                     <w:sz w:val="14"/>
                     <w:szCs w:val="14"/>
                   </w:rPr>
-                  <w:t xml:space="preserve">PENDING — TEAM INPUT REQUIRED</w:t>
+                  <w:t xml:space="preserve">(AI-drafted from the session record; member to confirm) Stale, not invented: after the fix the suites were rerun (109 / 31 pass) and the APK rebuilt (SHA-256 a533c6d0...ecd6f4). Docs corrected; see Docs/BUILD_REPORT.md.</w:t>
                 </w:r>
               </w:sdtContent>
             </w:sdt>
@@ -7677,7 +7677,7 @@
                     <w:sz w:val="14"/>
                     <w:szCs w:val="14"/>
                   </w:rPr>
-                  <w:t xml:space="preserve">PENDING — TEAM INPUT REQUIRED</w:t>
+                  <w:t xml:space="preserve">(AI-drafted from the session record; member to confirm) AI stated that the original START perfusion rule is capillary refill &gt; 2 s but could not open the CHEMM PDF (blocked) to confirm the 2 s figure.</w:t>
                 </w:r>
               </w:sdtContent>
             </w:sdt>
@@ -7746,7 +7746,7 @@
                     <w:sz w:val="14"/>
                     <w:szCs w:val="14"/>
                   </w:rPr>
-                  <w:t xml:space="preserve">PENDING — TEAM INPUT REQUIRED</w:t>
+                  <w:t xml:space="preserve">(AI-drafted from the session record; member to confirm) The 2 s threshold is not on the CHEMM text page the AI could read; it is marked "confirm" in 1.1. The team must check the original source before the viva.</w:t>
                 </w:r>
               </w:sdtContent>
             </w:sdt>

</xml_diff>